<commit_message>
Versao 1.3.0: raias fechadas e foco na proxima folha da pilha
- As raias comecam fechadas e ficam como a pessoa as deixou; a raia de uma folha
  selecionada pelo complemento abre sozinha.
- Ao mudar o status ou o local de uma folha na janela dela e fechar a janela, o
  foco vai para a proxima folha da mesma raia (a anterior, se era a ultima; a
  raia, se era a unica), e nao para a folha movida.
- Testes: entrada real de teclado e mouse descartada nas janelas de teste (a
  digitacao de fora mudava a selecao pela busca por digitacao da arvore).
- Manual em Word, readmes, SDD e roteiro manual atualizados. 582/582.

Co-Authored-By: Claude Opus 5.5 <noreply@anthropic.com>
</commit_message>
<xml_diff>
--- a/docs/Manual-NotasWorkflowNVDA.docx
+++ b/docs/Manual-NotasWorkflowNVDA.docx
@@ -15,7 +15,7 @@
         <w:pStyle w:val="Subtitle"/>
       </w:pPr>
       <w:r>
-        <w:t xml:space="preserve">Manual de uso — versão 1.2.0</w:t>
+        <w:t xml:space="preserve">Manual de uso — versão 1.3.0</w:t>
       </w:r>
     </w:p>
     <w:p>
@@ -152,7 +152,7 @@
       <w:pPr>
         <w:pStyle w:val="TOC1"/>
       </w:pPr>
-      <w:hyperlink w:anchor="_Secao29" w:history="1">
+      <w:hyperlink w:anchor="_Secao30" w:history="1">
         <w:r>
           <w:rPr>
             <w:rStyle w:val="Hyperlink"/>
@@ -165,7 +165,7 @@
       <w:pPr>
         <w:pStyle w:val="TOC1"/>
       </w:pPr>
-      <w:hyperlink w:anchor="_Secao30" w:history="1">
+      <w:hyperlink w:anchor="_Secao31" w:history="1">
         <w:r>
           <w:rPr>
             <w:rStyle w:val="Hyperlink"/>
@@ -178,7 +178,7 @@
       <w:pPr>
         <w:pStyle w:val="TOC1"/>
       </w:pPr>
-      <w:hyperlink w:anchor="_Secao33" w:history="1">
+      <w:hyperlink w:anchor="_Secao34" w:history="1">
         <w:r>
           <w:rPr>
             <w:rStyle w:val="Hyperlink"/>
@@ -191,7 +191,7 @@
       <w:pPr>
         <w:pStyle w:val="TOC1"/>
       </w:pPr>
-      <w:hyperlink w:anchor="_Secao34" w:history="1">
+      <w:hyperlink w:anchor="_Secao35" w:history="1">
         <w:r>
           <w:rPr>
             <w:rStyle w:val="Hyperlink"/>
@@ -204,7 +204,7 @@
       <w:pPr>
         <w:pStyle w:val="TOC1"/>
       </w:pPr>
-      <w:hyperlink w:anchor="_Secao38" w:history="1">
+      <w:hyperlink w:anchor="_Secao39" w:history="1">
         <w:r>
           <w:rPr>
             <w:rStyle w:val="Hyperlink"/>
@@ -217,7 +217,7 @@
       <w:pPr>
         <w:pStyle w:val="TOC1"/>
       </w:pPr>
-      <w:hyperlink w:anchor="_Secao41" w:history="1">
+      <w:hyperlink w:anchor="_Secao42" w:history="1">
         <w:r>
           <w:rPr>
             <w:rStyle w:val="Hyperlink"/>
@@ -230,7 +230,7 @@
       <w:pPr>
         <w:pStyle w:val="TOC1"/>
       </w:pPr>
-      <w:hyperlink w:anchor="_Secao44" w:history="1">
+      <w:hyperlink w:anchor="_Secao45" w:history="1">
         <w:r>
           <w:rPr>
             <w:rStyle w:val="Hyperlink"/>
@@ -243,7 +243,7 @@
       <w:pPr>
         <w:pStyle w:val="TOC1"/>
       </w:pPr>
-      <w:hyperlink w:anchor="_Secao45" w:history="1">
+      <w:hyperlink w:anchor="_Secao46" w:history="1">
         <w:r>
           <w:rPr>
             <w:rStyle w:val="Hyperlink"/>
@@ -256,7 +256,7 @@
       <w:pPr>
         <w:pStyle w:val="TOC1"/>
       </w:pPr>
-      <w:hyperlink w:anchor="_Secao46" w:history="1">
+      <w:hyperlink w:anchor="_Secao47" w:history="1">
         <w:r>
           <w:rPr>
             <w:rStyle w:val="Hyperlink"/>
@@ -269,7 +269,7 @@
       <w:pPr>
         <w:pStyle w:val="TOC1"/>
       </w:pPr>
-      <w:hyperlink w:anchor="_Secao52" w:history="1">
+      <w:hyperlink w:anchor="_Secao53" w:history="1">
         <w:r>
           <w:rPr>
             <w:rStyle w:val="Hyperlink"/>
@@ -304,7 +304,7 @@
         <w:t xml:space="preserve">Notas Workflow NVDA</w:t>
       </w:r>
       <w:r>
-        <w:t xml:space="preserve"> para o leitor de telas NVDA, versão 1.2.0. Ele é atualizado a cada nova versão do complemento.</w:t>
+        <w:t xml:space="preserve"> para o leitor de telas NVDA, versão 1.3.0. Ele é atualizado a cada nova versão do complemento.</w:t>
       </w:r>
     </w:p>
     <w:p>
@@ -724,7 +724,7 @@
         <w:rPr>
           <w:rStyle w:val="Codigo"/>
         </w:rPr>
-        <w:t xml:space="preserve">NotasWorkflowNVDA-1.2.0.nvda-addon</w:t>
+        <w:t xml:space="preserve">NotasWorkflowNVDA-1.3.0.nvda-addon</w:t>
       </w:r>
       <w:r>
         <w:t xml:space="preserve"> com o NVDA em execução, confirme a instalação e reinicie o NVDA quando ele pedir.</w:t>
@@ -792,7 +792,7 @@
         <w:rPr>
           <w:rStyle w:val="Codigo"/>
         </w:rPr>
-        <w:t xml:space="preserve">NotasWorkflowNVDA-1.2.0.nvda-addon</w:t>
+        <w:t xml:space="preserve">NotasWorkflowNVDA-1.3.0.nvda-addon</w:t>
       </w:r>
       <w:r>
         <w:t xml:space="preserve"> e reinicie o NVDA.</w:t>
@@ -921,7 +921,16 @@
         <w:t xml:space="preserve">NVDA+Alt+N</w:t>
       </w:r>
       <w:r>
-        <w:t xml:space="preserve"> para abrir a janela Notas Workflow NVDA. O foco fica na lista de folhas.</w:t>
+        <w:t xml:space="preserve"> para abrir a janela Notas Workflow NVDA. O foco fica na lista de folhas, na primeira raia. As raias começam fechadas: </w:t>
+      </w:r>
+      <w:r>
+        <w:rPr>
+          <w:b/>
+        </w:rPr>
+        <w:t xml:space="preserve">Seta para a direita</w:t>
+      </w:r>
+      <w:r>
+        <w:t xml:space="preserve"> abre uma raia e mostra as folhas dela.</w:t>
       </w:r>
     </w:p>
     <w:p>
@@ -1636,7 +1645,16 @@
     </w:p>
     <w:p>
       <w:r>
-        <w:t xml:space="preserve">Cada raia é um ramo já aberto, com o nome e o número de folhas, por exemplo "A fazer, 3 folhas". Dentro dele, cada folha é lida assim:</w:t>
+        <w:t xml:space="preserve">As raias </w:t>
+      </w:r>
+      <w:r>
+        <w:rPr>
+          <w:b/>
+        </w:rPr>
+        <w:t xml:space="preserve">começam fechadas</w:t>
+      </w:r>
+      <w:r>
+        <w:t xml:space="preserve">: cada uma é um ramo com o nome e o número de folhas, por exemplo "A fazer, 3 folhas", e você só ouve as folhas da raia que abrir. Dentro de uma raia aberta, cada folha é lida assim:</w:t>
       </w:r>
     </w:p>
     <w:p>
@@ -1649,7 +1667,25 @@
     </w:p>
     <w:p>
       <w:r>
-        <w:t xml:space="preserve">O local (caderno ou pasta) e as tags só aparecem quando existem. Seta para cima e para baixo percorrem raias e folhas; Seta para a esquerda fecha uma raia e Seta para a direita abre.</w:t>
+        <w:t xml:space="preserve">O local (caderno ou pasta) e as tags só aparecem quando existem. Seta para cima e para baixo percorrem raias e folhas; </w:t>
+      </w:r>
+      <w:r>
+        <w:rPr>
+          <w:b/>
+        </w:rPr>
+        <w:t xml:space="preserve">Seta para a direita abre</w:t>
+      </w:r>
+      <w:r>
+        <w:t xml:space="preserve"> uma raia e </w:t>
+      </w:r>
+      <w:r>
+        <w:rPr>
+          <w:b/>
+        </w:rPr>
+        <w:t xml:space="preserve">Seta para a esquerda fecha</w:t>
+      </w:r>
+      <w:r>
+        <w:t xml:space="preserve">. Quando uma folha é selecionada pelo complemento (ao criar uma folha, ao voltar da busca, ao mudar o status), a raia dela abre sozinha. Enquanto a janela estiver aberta, as raias ficam como você as deixou.</w:t>
       </w:r>
     </w:p>
     <w:p>
@@ -4076,7 +4112,7 @@
     </w:p>
     <w:p>
       <w:r>
-        <w:t xml:space="preserve">O NVDA fala "Status atualizado para" e o nome do status, e a seleção acompanha a folha. Também é possível mudar o status pelo campo Status da janela da folha.</w:t>
+        <w:t xml:space="preserve">O NVDA fala "Status atualizado para" e o nome do status, e a seleção acompanha a folha.</w:t>
       </w:r>
     </w:p>
     <w:p>
@@ -4085,19 +4121,49 @@
       </w:pPr>
       <w:bookmarkStart w:id="27" w:name="_Secao27"/>
       <w:r>
-        <w:t xml:space="preserve">Mover para um caderno ou uma pasta</w:t>
+        <w:t xml:space="preserve">Trabalhar a pilha de uma raia</w:t>
       </w:r>
       <w:bookmarkEnd w:id="27"/>
     </w:p>
     <w:p>
       <w:r>
+        <w:t xml:space="preserve">Também é possível mudar o status (ou o local) pelos campos </w:t>
+      </w:r>
+      <w:r>
         <w:rPr>
           <w:b/>
         </w:rPr>
-        <w:t xml:space="preserve">Mover para… (Alt+M)</w:t>
-      </w:r>
-      <w:r>
-        <w:t xml:space="preserve"> mostra uma lista com todos os lugares possíveis, começando no lugar atual da folha:</w:t>
+        <w:t xml:space="preserve">Status</w:t>
+      </w:r>
+      <w:r>
+        <w:t xml:space="preserve"> e </w:t>
+      </w:r>
+      <w:r>
+        <w:rPr>
+          <w:b/>
+        </w:rPr>
+        <w:t xml:space="preserve">Local</w:t>
+      </w:r>
+      <w:r>
+        <w:t xml:space="preserve"> da janela da folha. Nesse caso, ao fechar a janela da folha, o foco </w:t>
+      </w:r>
+      <w:r>
+        <w:rPr>
+          <w:b/>
+        </w:rPr>
+        <w:t xml:space="preserve">não acompanha a folha movida</w:t>
+      </w:r>
+      <w:r>
+        <w:t xml:space="preserve">: ele vai para a </w:t>
+      </w:r>
+      <w:r>
+        <w:rPr>
+          <w:b/>
+        </w:rPr>
+        <w:t xml:space="preserve">próxima folha da mesma raia</w:t>
+      </w:r>
+      <w:r>
+        <w:t xml:space="preserve">, a seguinte na pilha. Assim dá para tratar uma raia em sequência: Enter na primeira folha, mudar o status, Esc, e o foco já está na folha seguinte.</w:t>
       </w:r>
     </w:p>
     <w:p>
@@ -4109,7 +4175,7 @@
         </w:numPr>
       </w:pPr>
       <w:r>
-        <w:t xml:space="preserve">Folha solta (sem caderno nem pasta);</w:t>
+        <w:t xml:space="preserve">Se a folha movida era a última da raia, o foco vai para a anterior.</w:t>
       </w:r>
     </w:p>
     <w:p>
@@ -4121,7 +4187,7 @@
         </w:numPr>
       </w:pPr>
       <w:r>
-        <w:t xml:space="preserve">cada pasta ("Pasta Projetos"), para guardar a folha direto nela;</w:t>
+        <w:t xml:space="preserve">Se era a única, o foco vai para a própria raia.</w:t>
       </w:r>
     </w:p>
     <w:p>
@@ -4133,6 +4199,63 @@
         </w:numPr>
       </w:pPr>
       <w:r>
+        <w:t xml:space="preserve">Se você só editou a folha, sem mudar o status nem a tirar do que está sendo mostrado, o foco volta para ela.</w:t>
+      </w:r>
+    </w:p>
+    <w:p>
+      <w:pPr>
+        <w:pStyle w:val="Heading2"/>
+      </w:pPr>
+      <w:bookmarkStart w:id="28" w:name="_Secao28"/>
+      <w:r>
+        <w:t xml:space="preserve">Mover para um caderno ou uma pasta</w:t>
+      </w:r>
+      <w:bookmarkEnd w:id="28"/>
+    </w:p>
+    <w:p>
+      <w:r>
+        <w:rPr>
+          <w:b/>
+        </w:rPr>
+        <w:t xml:space="preserve">Mover para… (Alt+M)</w:t>
+      </w:r>
+      <w:r>
+        <w:t xml:space="preserve"> mostra uma lista com todos os lugares possíveis, começando no lugar atual da folha:</w:t>
+      </w:r>
+    </w:p>
+    <w:p>
+      <w:pPr>
+        <w:pStyle w:val="ListParagraph"/>
+        <w:numPr>
+          <w:ilvl w:val="0"/>
+          <w:numId w:val="1"/>
+        </w:numPr>
+      </w:pPr>
+      <w:r>
+        <w:t xml:space="preserve">Folha solta (sem caderno nem pasta);</w:t>
+      </w:r>
+    </w:p>
+    <w:p>
+      <w:pPr>
+        <w:pStyle w:val="ListParagraph"/>
+        <w:numPr>
+          <w:ilvl w:val="0"/>
+          <w:numId w:val="1"/>
+        </w:numPr>
+      </w:pPr>
+      <w:r>
+        <w:t xml:space="preserve">cada pasta ("Pasta Projetos"), para guardar a folha direto nela;</w:t>
+      </w:r>
+    </w:p>
+    <w:p>
+      <w:pPr>
+        <w:pStyle w:val="ListParagraph"/>
+        <w:numPr>
+          <w:ilvl w:val="0"/>
+          <w:numId w:val="1"/>
+        </w:numPr>
+      </w:pPr>
+      <w:r>
         <w:t xml:space="preserve">cada caderno, com a pasta dele ("Caderno Site (pasta Projetos)").</w:t>
       </w:r>
     </w:p>
@@ -4145,11 +4268,11 @@
       <w:pPr>
         <w:pStyle w:val="Heading2"/>
       </w:pPr>
-      <w:bookmarkStart w:id="28" w:name="_Secao28"/>
+      <w:bookmarkStart w:id="29" w:name="_Secao29"/>
       <w:r>
         <w:t xml:space="preserve">Excluir</w:t>
       </w:r>
-      <w:bookmarkEnd w:id="28"/>
+      <w:bookmarkEnd w:id="29"/>
     </w:p>
     <w:p>
       <w:r>
@@ -4184,11 +4307,11 @@
       <w:pPr>
         <w:pStyle w:val="Heading1"/>
       </w:pPr>
-      <w:bookmarkStart w:id="29" w:name="_Secao29"/>
+      <w:bookmarkStart w:id="30" w:name="_Secao30"/>
       <w:r>
         <w:t xml:space="preserve">Buscar folhas</w:t>
       </w:r>
-      <w:bookmarkEnd w:id="29"/>
+      <w:bookmarkEnd w:id="30"/>
     </w:p>
     <w:p>
       <w:r>
@@ -4591,11 +4714,11 @@
       <w:pPr>
         <w:pStyle w:val="Heading1"/>
       </w:pPr>
-      <w:bookmarkStart w:id="30" w:name="_Secao30"/>
+      <w:bookmarkStart w:id="31" w:name="_Secao31"/>
       <w:r>
         <w:t xml:space="preserve">Cadernos e pastas</w:t>
       </w:r>
-      <w:bookmarkEnd w:id="30"/>
+      <w:bookmarkEnd w:id="31"/>
     </w:p>
     <w:p>
       <w:r>
@@ -4615,11 +4738,11 @@
       <w:pPr>
         <w:pStyle w:val="Heading2"/>
       </w:pPr>
-      <w:bookmarkStart w:id="31" w:name="_Secao31"/>
+      <w:bookmarkStart w:id="32" w:name="_Secao32"/>
       <w:r>
         <w:t xml:space="preserve">A árvore Organização</w:t>
       </w:r>
-      <w:bookmarkEnd w:id="31"/>
+      <w:bookmarkEnd w:id="32"/>
     </w:p>
     <w:p>
       <w:r>
@@ -4701,11 +4824,11 @@
       <w:pPr>
         <w:pStyle w:val="Heading2"/>
       </w:pPr>
-      <w:bookmarkStart w:id="32" w:name="_Secao32"/>
+      <w:bookmarkStart w:id="33" w:name="_Secao33"/>
       <w:r>
         <w:t xml:space="preserve">Botões</w:t>
       </w:r>
-      <w:bookmarkEnd w:id="32"/>
+      <w:bookmarkEnd w:id="33"/>
     </w:p>
     <w:tbl>
       <w:tblPr>
@@ -5034,11 +5157,11 @@
       <w:pPr>
         <w:pStyle w:val="Heading1"/>
       </w:pPr>
-      <w:bookmarkStart w:id="33" w:name="_Secao33"/>
+      <w:bookmarkStart w:id="34" w:name="_Secao34"/>
       <w:r>
         <w:t xml:space="preserve">Configurações</w:t>
       </w:r>
-      <w:bookmarkEnd w:id="33"/>
+      <w:bookmarkEnd w:id="34"/>
     </w:p>
     <w:p>
       <w:r>
@@ -5513,11 +5636,11 @@
       <w:pPr>
         <w:pStyle w:val="Heading1"/>
       </w:pPr>
-      <w:bookmarkStart w:id="34" w:name="_Secao34"/>
+      <w:bookmarkStart w:id="35" w:name="_Secao35"/>
       <w:r>
         <w:t xml:space="preserve">Onde ficam as folhas</w:t>
       </w:r>
-      <w:bookmarkEnd w:id="34"/>
+      <w:bookmarkEnd w:id="35"/>
     </w:p>
     <w:p>
       <w:r>
@@ -5555,11 +5678,11 @@
       <w:pPr>
         <w:pStyle w:val="Heading2"/>
       </w:pPr>
-      <w:bookmarkStart w:id="35" w:name="_Secao35"/>
+      <w:bookmarkStart w:id="36" w:name="_Secao36"/>
       <w:r>
         <w:t xml:space="preserve">Segurança dos dados</w:t>
       </w:r>
-      <w:bookmarkEnd w:id="35"/>
+      <w:bookmarkEnd w:id="36"/>
     </w:p>
     <w:p>
       <w:pPr>
@@ -5631,11 +5754,11 @@
       <w:pPr>
         <w:pStyle w:val="Heading2"/>
       </w:pPr>
-      <w:bookmarkStart w:id="36" w:name="_Secao36"/>
+      <w:bookmarkStart w:id="37" w:name="_Secao37"/>
       <w:r>
         <w:t xml:space="preserve">Muitas folhas</w:t>
       </w:r>
-      <w:bookmarkEnd w:id="36"/>
+      <w:bookmarkEnd w:id="37"/>
     </w:p>
     <w:p>
       <w:r>
@@ -5646,11 +5769,11 @@
       <w:pPr>
         <w:pStyle w:val="Heading2"/>
       </w:pPr>
-      <w:bookmarkStart w:id="37" w:name="_Secao37"/>
+      <w:bookmarkStart w:id="38" w:name="_Secao38"/>
       <w:r>
         <w:t xml:space="preserve">Usar em mais de um computador</w:t>
       </w:r>
-      <w:bookmarkEnd w:id="37"/>
+      <w:bookmarkEnd w:id="38"/>
     </w:p>
     <w:p>
       <w:r>
@@ -5702,21 +5825,21 @@
       <w:pPr>
         <w:pStyle w:val="Heading1"/>
       </w:pPr>
-      <w:bookmarkStart w:id="38" w:name="_Secao38"/>
+      <w:bookmarkStart w:id="39" w:name="_Secao39"/>
       <w:r>
         <w:t xml:space="preserve">Importar e exportar</w:t>
       </w:r>
-      <w:bookmarkEnd w:id="38"/>
+      <w:bookmarkEnd w:id="39"/>
     </w:p>
     <w:p>
       <w:pPr>
         <w:pStyle w:val="Heading2"/>
       </w:pPr>
-      <w:bookmarkStart w:id="39" w:name="_Secao39"/>
+      <w:bookmarkStart w:id="40" w:name="_Secao40"/>
       <w:r>
         <w:t xml:space="preserve">Exportar</w:t>
       </w:r>
-      <w:bookmarkEnd w:id="39"/>
+      <w:bookmarkEnd w:id="40"/>
     </w:p>
     <w:p>
       <w:r>
@@ -5742,11 +5865,11 @@
       <w:pPr>
         <w:pStyle w:val="Heading2"/>
       </w:pPr>
-      <w:bookmarkStart w:id="40" w:name="_Secao40"/>
+      <w:bookmarkStart w:id="41" w:name="_Secao41"/>
       <w:r>
         <w:t xml:space="preserve">Importar</w:t>
       </w:r>
-      <w:bookmarkEnd w:id="40"/>
+      <w:bookmarkEnd w:id="41"/>
     </w:p>
     <w:p>
       <w:r>
@@ -5804,21 +5927,21 @@
       <w:pPr>
         <w:pStyle w:val="Heading1"/>
       </w:pPr>
-      <w:bookmarkStart w:id="41" w:name="_Secao41"/>
+      <w:bookmarkStart w:id="42" w:name="_Secao42"/>
       <w:r>
         <w:t xml:space="preserve">Atalhos</w:t>
       </w:r>
-      <w:bookmarkEnd w:id="41"/>
+      <w:bookmarkEnd w:id="42"/>
     </w:p>
     <w:p>
       <w:pPr>
         <w:pStyle w:val="Heading2"/>
       </w:pPr>
-      <w:bookmarkStart w:id="42" w:name="_Secao42"/>
+      <w:bookmarkStart w:id="43" w:name="_Secao43"/>
       <w:r>
         <w:t xml:space="preserve">Comandos globais</w:t>
       </w:r>
-      <w:bookmarkEnd w:id="42"/>
+      <w:bookmarkEnd w:id="43"/>
     </w:p>
     <w:tbl>
       <w:tblPr>
@@ -6026,11 +6149,11 @@
       <w:pPr>
         <w:pStyle w:val="Heading2"/>
       </w:pPr>
-      <w:bookmarkStart w:id="43" w:name="_Secao43"/>
+      <w:bookmarkStart w:id="44" w:name="_Secao44"/>
       <w:r>
         <w:t xml:space="preserve">Dentro das janelas</w:t>
       </w:r>
-      <w:bookmarkEnd w:id="43"/>
+      <w:bookmarkEnd w:id="44"/>
     </w:p>
     <w:tbl>
       <w:tblPr>
@@ -6533,11 +6656,11 @@
       <w:pPr>
         <w:pStyle w:val="Heading1"/>
       </w:pPr>
-      <w:bookmarkStart w:id="44" w:name="_Secao44"/>
+      <w:bookmarkStart w:id="45" w:name="_Secao45"/>
       <w:r>
         <w:t xml:space="preserve">Mensagens faladas</w:t>
       </w:r>
-      <w:bookmarkEnd w:id="44"/>
+      <w:bookmarkEnd w:id="45"/>
     </w:p>
     <w:tbl>
       <w:tblPr>
@@ -7226,11 +7349,11 @@
       <w:pPr>
         <w:pStyle w:val="Heading1"/>
       </w:pPr>
-      <w:bookmarkStart w:id="45" w:name="_Secao45"/>
+      <w:bookmarkStart w:id="46" w:name="_Secao46"/>
       <w:r>
         <w:t xml:space="preserve">Privacidade e segurança</w:t>
       </w:r>
-      <w:bookmarkEnd w:id="45"/>
+      <w:bookmarkEnd w:id="46"/>
     </w:p>
     <w:p>
       <w:pPr>
@@ -7326,21 +7449,21 @@
       <w:pPr>
         <w:pStyle w:val="Heading1"/>
       </w:pPr>
-      <w:bookmarkStart w:id="46" w:name="_Secao46"/>
+      <w:bookmarkStart w:id="47" w:name="_Secao47"/>
       <w:r>
         <w:t xml:space="preserve">Perguntas frequentes</w:t>
       </w:r>
-      <w:bookmarkEnd w:id="46"/>
+      <w:bookmarkEnd w:id="47"/>
     </w:p>
     <w:p>
       <w:pPr>
         <w:pStyle w:val="Heading2"/>
       </w:pPr>
-      <w:bookmarkStart w:id="47" w:name="_Secao47"/>
+      <w:bookmarkStart w:id="48" w:name="_Secao48"/>
       <w:r>
         <w:t xml:space="preserve">O NVDA diz que não foi possível salvar as folhas</w:t>
       </w:r>
-      <w:bookmarkEnd w:id="47"/>
+      <w:bookmarkEnd w:id="48"/>
     </w:p>
     <w:p>
       <w:r>
@@ -7360,11 +7483,11 @@
       <w:pPr>
         <w:pStyle w:val="Heading2"/>
       </w:pPr>
-      <w:bookmarkStart w:id="48" w:name="_Secao48"/>
+      <w:bookmarkStart w:id="49" w:name="_Secao49"/>
       <w:r>
         <w:t xml:space="preserve">Minhas folhas sumiram depois de trocar a pasta</w:t>
       </w:r>
-      <w:bookmarkEnd w:id="48"/>
+      <w:bookmarkEnd w:id="49"/>
     </w:p>
     <w:p>
       <w:r>
@@ -7375,11 +7498,11 @@
       <w:pPr>
         <w:pStyle w:val="Heading2"/>
       </w:pPr>
-      <w:bookmarkStart w:id="49" w:name="_Secao49"/>
+      <w:bookmarkStart w:id="50" w:name="_Secao50"/>
       <w:r>
         <w:t xml:space="preserve">O arquivo estava danificado</w:t>
       </w:r>
-      <w:bookmarkEnd w:id="49"/>
+      <w:bookmarkEnd w:id="50"/>
     </w:p>
     <w:p>
       <w:r>
@@ -7399,11 +7522,11 @@
       <w:pPr>
         <w:pStyle w:val="Heading2"/>
       </w:pPr>
-      <w:bookmarkStart w:id="50" w:name="_Secao50"/>
+      <w:bookmarkStart w:id="51" w:name="_Secao51"/>
       <w:r>
         <w:t xml:space="preserve">Não encontro uma folha numa raia com muitas folhas</w:t>
       </w:r>
-      <w:bookmarkEnd w:id="50"/>
+      <w:bookmarkEnd w:id="51"/>
     </w:p>
     <w:p>
       <w:r>
@@ -7414,11 +7537,11 @@
       <w:pPr>
         <w:pStyle w:val="Heading2"/>
       </w:pPr>
-      <w:bookmarkStart w:id="51" w:name="_Secao51"/>
+      <w:bookmarkStart w:id="52" w:name="_Secao52"/>
       <w:r>
         <w:t xml:space="preserve">Escrevi um asterisco e ele sumiu</w:t>
       </w:r>
-      <w:bookmarkEnd w:id="51"/>
+      <w:bookmarkEnd w:id="52"/>
     </w:p>
     <w:p>
       <w:r>
@@ -7447,11 +7570,11 @@
       <w:pPr>
         <w:pStyle w:val="Heading1"/>
       </w:pPr>
-      <w:bookmarkStart w:id="52" w:name="_Secao52"/>
+      <w:bookmarkStart w:id="53" w:name="_Secao53"/>
       <w:r>
         <w:t xml:space="preserve">Histórico deste manual</w:t>
       </w:r>
-      <w:bookmarkEnd w:id="52"/>
+      <w:bookmarkEnd w:id="53"/>
     </w:p>
     <w:tbl>
       <w:tblPr>
@@ -7565,6 +7688,39 @@
             </w:pPr>
             <w:r>
               <w:t xml:space="preserve">Novo nome do complemento, Notas Workflow NVDA, com os novos nomes de pasta e arquivo; nova seção "Quem usava o NotasWorkflow 1.0.0" com a migração das folhas; nova mensagem falada da migração.</w:t>
+            </w:r>
+          </w:p>
+        </w:tc>
+      </w:tr>
+      <w:tr>
+        <w:trPr>
+          <w:cantSplit/>
+        </w:trPr>
+        <w:tc>
+          <w:tcPr>
+            <w:tcW w:w="1302" w:type="dxa"/>
+            <w:shd w:val="clear" w:color="auto" w:fill="FFFFFF"/>
+          </w:tcPr>
+          <w:p>
+            <w:pPr>
+              <w:pStyle w:val="TextoTabela"/>
+            </w:pPr>
+            <w:r>
+              <w:t xml:space="preserve">1.3.0</w:t>
+            </w:r>
+          </w:p>
+        </w:tc>
+        <w:tc>
+          <w:tcPr>
+            <w:tcW w:w="8336" w:type="dxa"/>
+            <w:shd w:val="clear" w:color="auto" w:fill="FFFFFF"/>
+          </w:tcPr>
+          <w:p>
+            <w:pPr>
+              <w:pStyle w:val="TextoTabela"/>
+            </w:pPr>
+            <w:r>
+              <w:t xml:space="preserve">As raias começam fechadas e ficam como você as deixou; ao mudar o status ou o local na janela da folha, o foco vai para a próxima folha da mesma raia (nova seção "Trabalhar a pilha de uma raia").</w:t>
             </w:r>
           </w:p>
         </w:tc>
@@ -7624,7 +7780,7 @@
       <w:pStyle w:val="Footer"/>
     </w:pPr>
     <w:r>
-      <w:t xml:space="preserve">Notas Workflow NVDA 1.2.0 — página </w:t>
+      <w:t xml:space="preserve">Notas Workflow NVDA 1.3.0 — página </w:t>
     </w:r>
     <w:r>
       <w:fldChar w:fldCharType="begin"/>

</xml_diff>

<commit_message>
Versao 1.4.0: Exportar como documento (Word, Markdown e HTML) - Botao Exportar na janela principal: menu Folha selecionada, Caderno e Pasta;   o caderno ou a pasta mostrada (ou o da folha selecionada) ja vem escolhido. - Formatos Word (.docx), Markdown (.md) e HTML (.html), gerados so com a   biblioteca padrao (novo modulo exporter.py); sem PDF por enquanto. - Caderno e pasta: um arquivo com todas as folhas (titulos por nivel, folhas na   ordem das raias) ou um arquivo para cada folha (pasta nova, subpasta por   caderno, nomes limpos, nada sobrescrito). - Cada folha com titulo, status, tags, datas e o conteudo formatado; HTML   exportado so com as tags dos formatos do editor. - Gravacao em segundo plano com o resultado falado (100 mil folhas: janela em   0,05 s, maior pasta gravada em 2,7 s). - Testes FUN-27, PERF-14, SEG-01/06/08; manual em Word, readmes, SDD e roteiro   manual atualizados. 632/632.
Co-Authored-By: Claude Opus 5.5 <noreply@anthropic.com>
</commit_message>
<xml_diff>
--- a/docs/Manual-NotasWorkflowNVDA.docx
+++ b/docs/Manual-NotasWorkflowNVDA.docx
@@ -15,7 +15,7 @@
         <w:pStyle w:val="Subtitle"/>
       </w:pPr>
       <w:r>
-        <w:t xml:space="preserve">Manual de uso — versão 1.3.0</w:t>
+        <w:t xml:space="preserve">Manual de uso — versão 1.4.0</w:t>
       </w:r>
     </w:p>
     <w:p>
@@ -183,6 +183,19 @@
           <w:rPr>
             <w:rStyle w:val="Hyperlink"/>
           </w:rPr>
+          <w:t xml:space="preserve">Exportar como documento</w:t>
+        </w:r>
+      </w:hyperlink>
+    </w:p>
+    <w:p>
+      <w:pPr>
+        <w:pStyle w:val="TOC1"/>
+      </w:pPr>
+      <w:hyperlink w:anchor="_Secao38" w:history="1">
+        <w:r>
+          <w:rPr>
+            <w:rStyle w:val="Hyperlink"/>
+          </w:rPr>
           <w:t xml:space="preserve">Configurações</w:t>
         </w:r>
       </w:hyperlink>
@@ -191,7 +204,7 @@
       <w:pPr>
         <w:pStyle w:val="TOC1"/>
       </w:pPr>
-      <w:hyperlink w:anchor="_Secao35" w:history="1">
+      <w:hyperlink w:anchor="_Secao39" w:history="1">
         <w:r>
           <w:rPr>
             <w:rStyle w:val="Hyperlink"/>
@@ -204,7 +217,7 @@
       <w:pPr>
         <w:pStyle w:val="TOC1"/>
       </w:pPr>
-      <w:hyperlink w:anchor="_Secao39" w:history="1">
+      <w:hyperlink w:anchor="_Secao43" w:history="1">
         <w:r>
           <w:rPr>
             <w:rStyle w:val="Hyperlink"/>
@@ -217,7 +230,7 @@
       <w:pPr>
         <w:pStyle w:val="TOC1"/>
       </w:pPr>
-      <w:hyperlink w:anchor="_Secao42" w:history="1">
+      <w:hyperlink w:anchor="_Secao46" w:history="1">
         <w:r>
           <w:rPr>
             <w:rStyle w:val="Hyperlink"/>
@@ -230,7 +243,7 @@
       <w:pPr>
         <w:pStyle w:val="TOC1"/>
       </w:pPr>
-      <w:hyperlink w:anchor="_Secao45" w:history="1">
+      <w:hyperlink w:anchor="_Secao49" w:history="1">
         <w:r>
           <w:rPr>
             <w:rStyle w:val="Hyperlink"/>
@@ -243,7 +256,7 @@
       <w:pPr>
         <w:pStyle w:val="TOC1"/>
       </w:pPr>
-      <w:hyperlink w:anchor="_Secao46" w:history="1">
+      <w:hyperlink w:anchor="_Secao50" w:history="1">
         <w:r>
           <w:rPr>
             <w:rStyle w:val="Hyperlink"/>
@@ -256,7 +269,7 @@
       <w:pPr>
         <w:pStyle w:val="TOC1"/>
       </w:pPr>
-      <w:hyperlink w:anchor="_Secao47" w:history="1">
+      <w:hyperlink w:anchor="_Secao51" w:history="1">
         <w:r>
           <w:rPr>
             <w:rStyle w:val="Hyperlink"/>
@@ -269,7 +282,7 @@
       <w:pPr>
         <w:pStyle w:val="TOC1"/>
       </w:pPr>
-      <w:hyperlink w:anchor="_Secao53" w:history="1">
+      <w:hyperlink w:anchor="_Secao57" w:history="1">
         <w:r>
           <w:rPr>
             <w:rStyle w:val="Hyperlink"/>
@@ -304,7 +317,7 @@
         <w:t xml:space="preserve">Notas Workflow NVDA</w:t>
       </w:r>
       <w:r>
-        <w:t xml:space="preserve"> para o leitor de telas NVDA, versão 1.3.0. Ele é atualizado a cada nova versão do complemento.</w:t>
+        <w:t xml:space="preserve"> para o leitor de telas NVDA, versão 1.4.0. Ele é atualizado a cada nova versão do complemento.</w:t>
       </w:r>
     </w:p>
     <w:p>
@@ -724,7 +737,7 @@
         <w:rPr>
           <w:rStyle w:val="Codigo"/>
         </w:rPr>
-        <w:t xml:space="preserve">NotasWorkflowNVDA-1.3.0.nvda-addon</w:t>
+        <w:t xml:space="preserve">NotasWorkflowNVDA-1.4.0.nvda-addon</w:t>
       </w:r>
       <w:r>
         <w:t xml:space="preserve"> com o NVDA em execução, confirme a instalação e reinicie o NVDA quando ele pedir.</w:t>
@@ -792,7 +805,7 @@
         <w:rPr>
           <w:rStyle w:val="Codigo"/>
         </w:rPr>
-        <w:t xml:space="preserve">NotasWorkflowNVDA-1.3.0.nvda-addon</w:t>
+        <w:t xml:space="preserve">NotasWorkflowNVDA-1.4.0.nvda-addon</w:t>
       </w:r>
       <w:r>
         <w:t xml:space="preserve"> e reinicie o NVDA.</w:t>
@@ -1589,6 +1602,53 @@
               <w:pStyle w:val="TextoTabela"/>
             </w:pPr>
             <w:r>
+              <w:t xml:space="preserve">Exportar…</w:t>
+            </w:r>
+          </w:p>
+        </w:tc>
+        <w:tc>
+          <w:tcPr>
+            <w:tcW w:w="1364" w:type="dxa"/>
+            <w:shd w:val="clear" w:color="auto" w:fill="FFFFFF"/>
+          </w:tcPr>
+          <w:p>
+            <w:pPr>
+              <w:pStyle w:val="TextoTabela"/>
+            </w:pPr>
+            <w:r>
+              <w:t xml:space="preserve">Alt+E</w:t>
+            </w:r>
+          </w:p>
+        </w:tc>
+        <w:tc>
+          <w:tcPr>
+            <w:tcW w:w="5460" w:type="dxa"/>
+            <w:shd w:val="clear" w:color="auto" w:fill="FFFFFF"/>
+          </w:tcPr>
+          <w:p>
+            <w:pPr>
+              <w:pStyle w:val="TextoTabela"/>
+            </w:pPr>
+            <w:r>
+              <w:t xml:space="preserve">Exporta a folha selecionada, um caderno ou uma pasta como documento do Word, Markdown ou HTML (veja Exportar como documento).</w:t>
+            </w:r>
+          </w:p>
+        </w:tc>
+      </w:tr>
+      <w:tr>
+        <w:trPr>
+          <w:cantSplit/>
+        </w:trPr>
+        <w:tc>
+          <w:tcPr>
+            <w:tcW w:w="2814" w:type="dxa"/>
+            <w:shd w:val="clear" w:color="auto" w:fill="FFFFFF"/>
+          </w:tcPr>
+          <w:p>
+            <w:pPr>
+              <w:pStyle w:val="TextoTabela"/>
+            </w:pPr>
+            <w:r>
               <w:t xml:space="preserve">Fechar</w:t>
             </w:r>
           </w:p>
@@ -5159,9 +5219,693 @@
       </w:pPr>
       <w:bookmarkStart w:id="34" w:name="_Secao34"/>
       <w:r>
+        <w:t xml:space="preserve">Exportar como documento</w:t>
+      </w:r>
+      <w:bookmarkEnd w:id="34"/>
+    </w:p>
+    <w:p>
+      <w:r>
+        <w:t xml:space="preserve">O botão </w:t>
+      </w:r>
+      <w:r>
+        <w:rPr>
+          <w:b/>
+        </w:rPr>
+        <w:t xml:space="preserve">Exportar… (Alt+E)</w:t>
+      </w:r>
+      <w:r>
+        <w:t xml:space="preserve"> da janela principal grava folhas como documentos para ler, imprimir ou enviar a outras pessoas: um documento do </w:t>
+      </w:r>
+      <w:r>
+        <w:rPr>
+          <w:b/>
+        </w:rPr>
+        <w:t xml:space="preserve">Word</w:t>
+      </w:r>
+      <w:r>
+        <w:t xml:space="preserve">, um arquivo </w:t>
+      </w:r>
+      <w:r>
+        <w:rPr>
+          <w:b/>
+        </w:rPr>
+        <w:t xml:space="preserve">Markdown</w:t>
+      </w:r>
+      <w:r>
+        <w:t xml:space="preserve"> ou uma </w:t>
+      </w:r>
+      <w:r>
+        <w:rPr>
+          <w:b/>
+        </w:rPr>
+        <w:t xml:space="preserve">página HTML</w:t>
+      </w:r>
+      <w:r>
+        <w:t xml:space="preserve">, que abre em qualquer navegador. É diferente de Exportar folhas… das configurações, que grava a cópia de segurança </w:t>
+      </w:r>
+      <w:r>
+        <w:rPr>
+          <w:rStyle w:val="Codigo"/>
+        </w:rPr>
+        <w:t xml:space="preserve">.json</w:t>
+      </w:r>
+      <w:r>
+        <w:t xml:space="preserve"> (veja Importar e exportar).</w:t>
+      </w:r>
+    </w:p>
+    <w:p>
+      <w:pPr>
+        <w:pStyle w:val="Heading2"/>
+      </w:pPr>
+      <w:bookmarkStart w:id="35" w:name="_Secao35"/>
+      <w:r>
+        <w:t xml:space="preserve">O que exportar</w:t>
+      </w:r>
+      <w:bookmarkEnd w:id="35"/>
+    </w:p>
+    <w:p>
+      <w:r>
+        <w:t xml:space="preserve">O botão abre um menu com:</w:t>
+      </w:r>
+    </w:p>
+    <w:tbl>
+      <w:tblPr>
+        <w:tblStyle w:val="TabelaManual"/>
+        <w:tblW w:w="9638" w:type="dxa"/>
+        <w:tblLook w:val="04A0" w:firstRow="1" w:lastRow="0" w:firstColumn="0" w:lastColumn="0" w:noHBand="0" w:noVBand="1"/>
+      </w:tblPr>
+      <w:tblGrid>
+        <w:gridCol w:w="2465"/>
+        <w:gridCol w:w="7173"/>
+      </w:tblGrid>
+      <w:tr>
+        <w:trPr>
+          <w:tblHeader/>
+          <w:cantSplit/>
+        </w:trPr>
+        <w:tc>
+          <w:tcPr>
+            <w:tcW w:w="2465" w:type="dxa"/>
+            <w:shd w:val="clear" w:color="auto" w:fill="DCE6F1"/>
+          </w:tcPr>
+          <w:p>
+            <w:pPr>
+              <w:pStyle w:val="TextoTabela"/>
+            </w:pPr>
+            <w:r>
+              <w:rPr>
+                <w:b/>
+              </w:rPr>
+              <w:t xml:space="preserve">Opção</w:t>
+            </w:r>
+          </w:p>
+        </w:tc>
+        <w:tc>
+          <w:tcPr>
+            <w:tcW w:w="7173" w:type="dxa"/>
+            <w:shd w:val="clear" w:color="auto" w:fill="DCE6F1"/>
+          </w:tcPr>
+          <w:p>
+            <w:pPr>
+              <w:pStyle w:val="TextoTabela"/>
+            </w:pPr>
+            <w:r>
+              <w:rPr>
+                <w:b/>
+              </w:rPr>
+              <w:t xml:space="preserve">O que exporta</w:t>
+            </w:r>
+          </w:p>
+        </w:tc>
+      </w:tr>
+      <w:tr>
+        <w:trPr>
+          <w:cantSplit/>
+        </w:trPr>
+        <w:tc>
+          <w:tcPr>
+            <w:tcW w:w="2465" w:type="dxa"/>
+            <w:shd w:val="clear" w:color="auto" w:fill="FFFFFF"/>
+          </w:tcPr>
+          <w:p>
+            <w:pPr>
+              <w:pStyle w:val="TextoTabela"/>
+            </w:pPr>
+            <w:r>
+              <w:t xml:space="preserve">Folha selecionada…</w:t>
+            </w:r>
+          </w:p>
+        </w:tc>
+        <w:tc>
+          <w:tcPr>
+            <w:tcW w:w="7173" w:type="dxa"/>
+            <w:shd w:val="clear" w:color="auto" w:fill="FFFFFF"/>
+          </w:tcPr>
+          <w:p>
+            <w:pPr>
+              <w:pStyle w:val="TextoTabela"/>
+            </w:pPr>
+            <w:r>
+              <w:t xml:space="preserve">A folha selecionada na lista. Só aparece quando uma folha está selecionada.</w:t>
+            </w:r>
+          </w:p>
+        </w:tc>
+      </w:tr>
+      <w:tr>
+        <w:trPr>
+          <w:cantSplit/>
+        </w:trPr>
+        <w:tc>
+          <w:tcPr>
+            <w:tcW w:w="2465" w:type="dxa"/>
+            <w:shd w:val="clear" w:color="auto" w:fill="FFFFFF"/>
+          </w:tcPr>
+          <w:p>
+            <w:pPr>
+              <w:pStyle w:val="TextoTabela"/>
+            </w:pPr>
+            <w:r>
+              <w:t xml:space="preserve">Caderno…</w:t>
+            </w:r>
+          </w:p>
+        </w:tc>
+        <w:tc>
+          <w:tcPr>
+            <w:tcW w:w="7173" w:type="dxa"/>
+            <w:shd w:val="clear" w:color="auto" w:fill="FFFFFF"/>
+          </w:tcPr>
+          <w:p>
+            <w:pPr>
+              <w:pStyle w:val="TextoTabela"/>
+            </w:pPr>
+            <w:r>
+              <w:t xml:space="preserve">Todas as folhas de um caderno. Uma lista pergunta qual caderno, começando no caderno mostrado na caixa Mostrar ou no caderno da folha selecionada.</w:t>
+            </w:r>
+          </w:p>
+        </w:tc>
+      </w:tr>
+      <w:tr>
+        <w:trPr>
+          <w:cantSplit/>
+        </w:trPr>
+        <w:tc>
+          <w:tcPr>
+            <w:tcW w:w="2465" w:type="dxa"/>
+            <w:shd w:val="clear" w:color="auto" w:fill="FFFFFF"/>
+          </w:tcPr>
+          <w:p>
+            <w:pPr>
+              <w:pStyle w:val="TextoTabela"/>
+            </w:pPr>
+            <w:r>
+              <w:t xml:space="preserve">Pasta…</w:t>
+            </w:r>
+          </w:p>
+        </w:tc>
+        <w:tc>
+          <w:tcPr>
+            <w:tcW w:w="7173" w:type="dxa"/>
+            <w:shd w:val="clear" w:color="auto" w:fill="FFFFFF"/>
+          </w:tcPr>
+          <w:p>
+            <w:pPr>
+              <w:pStyle w:val="TextoTabela"/>
+            </w:pPr>
+            <w:r>
+              <w:t xml:space="preserve">Todas as folhas de uma pasta: as guardadas direto nela e as dos cadernos dela. Uma lista pergunta qual pasta, começando na pasta mostrada ou na pasta da folha selecionada.</w:t>
+            </w:r>
+          </w:p>
+        </w:tc>
+      </w:tr>
+    </w:tbl>
+    <w:p>
+      <w:pPr>
+        <w:pStyle w:val="Espaco"/>
+      </w:pPr>
+    </w:p>
+    <w:p>
+      <w:r>
+        <w:t xml:space="preserve">Se não houver nenhum caderno (ou nenhuma pasta), o NVDA fala "Não há cadernos." (ou "Não há pastas."). Um caderno ou uma pasta sem folhas não é exportado: o NVDA fala "Nada para exportar:" e o nome.</w:t>
+      </w:r>
+    </w:p>
+    <w:p>
+      <w:pPr>
+        <w:pStyle w:val="Heading2"/>
+      </w:pPr>
+      <w:bookmarkStart w:id="36" w:name="_Secao36"/>
+      <w:r>
+        <w:t xml:space="preserve">Formato e arquivos</w:t>
+      </w:r>
+      <w:bookmarkEnd w:id="36"/>
+    </w:p>
+    <w:p>
+      <w:r>
+        <w:t xml:space="preserve">Depois, uma lista pergunta o formato:</w:t>
+      </w:r>
+    </w:p>
+    <w:tbl>
+      <w:tblPr>
+        <w:tblStyle w:val="TabelaManual"/>
+        <w:tblW w:w="9638" w:type="dxa"/>
+        <w:tblLook w:val="04A0" w:firstRow="1" w:lastRow="0" w:firstColumn="0" w:lastColumn="0" w:noHBand="0" w:noVBand="1"/>
+      </w:tblPr>
+      <w:tblGrid>
+        <w:gridCol w:w="2687"/>
+        <w:gridCol w:w="1100"/>
+        <w:gridCol w:w="5851"/>
+      </w:tblGrid>
+      <w:tr>
+        <w:trPr>
+          <w:tblHeader/>
+          <w:cantSplit/>
+        </w:trPr>
+        <w:tc>
+          <w:tcPr>
+            <w:tcW w:w="2687" w:type="dxa"/>
+            <w:shd w:val="clear" w:color="auto" w:fill="DCE6F1"/>
+          </w:tcPr>
+          <w:p>
+            <w:pPr>
+              <w:pStyle w:val="TextoTabela"/>
+            </w:pPr>
+            <w:r>
+              <w:rPr>
+                <w:b/>
+              </w:rPr>
+              <w:t xml:space="preserve">Formato</w:t>
+            </w:r>
+          </w:p>
+        </w:tc>
+        <w:tc>
+          <w:tcPr>
+            <w:tcW w:w="1100" w:type="dxa"/>
+            <w:shd w:val="clear" w:color="auto" w:fill="DCE6F1"/>
+          </w:tcPr>
+          <w:p>
+            <w:pPr>
+              <w:pStyle w:val="TextoTabela"/>
+            </w:pPr>
+            <w:r>
+              <w:rPr>
+                <w:b/>
+              </w:rPr>
+              <w:t xml:space="preserve">Arquivo</w:t>
+            </w:r>
+          </w:p>
+        </w:tc>
+        <w:tc>
+          <w:tcPr>
+            <w:tcW w:w="5851" w:type="dxa"/>
+            <w:shd w:val="clear" w:color="auto" w:fill="DCE6F1"/>
+          </w:tcPr>
+          <w:p>
+            <w:pPr>
+              <w:pStyle w:val="TextoTabela"/>
+            </w:pPr>
+            <w:r>
+              <w:rPr>
+                <w:b/>
+              </w:rPr>
+              <w:t xml:space="preserve">Bom para</w:t>
+            </w:r>
+          </w:p>
+        </w:tc>
+      </w:tr>
+      <w:tr>
+        <w:trPr>
+          <w:cantSplit/>
+        </w:trPr>
+        <w:tc>
+          <w:tcPr>
+            <w:tcW w:w="2687" w:type="dxa"/>
+            <w:shd w:val="clear" w:color="auto" w:fill="FFFFFF"/>
+          </w:tcPr>
+          <w:p>
+            <w:pPr>
+              <w:pStyle w:val="TextoTabela"/>
+            </w:pPr>
+            <w:r>
+              <w:t xml:space="preserve">Documento do Word (.docx)</w:t>
+            </w:r>
+          </w:p>
+        </w:tc>
+        <w:tc>
+          <w:tcPr>
+            <w:tcW w:w="1100" w:type="dxa"/>
+            <w:shd w:val="clear" w:color="auto" w:fill="FFFFFF"/>
+          </w:tcPr>
+          <w:p>
+            <w:pPr>
+              <w:pStyle w:val="TextoTabela"/>
+            </w:pPr>
+            <w:r>
+              <w:rPr>
+                <w:rStyle w:val="Codigo"/>
+              </w:rPr>
+              <w:t xml:space="preserve">.docx</w:t>
+            </w:r>
+          </w:p>
+        </w:tc>
+        <w:tc>
+          <w:tcPr>
+            <w:tcW w:w="5851" w:type="dxa"/>
+            <w:shd w:val="clear" w:color="auto" w:fill="FFFFFF"/>
+          </w:tcPr>
+          <w:p>
+            <w:pPr>
+              <w:pStyle w:val="TextoTabela"/>
+            </w:pPr>
+            <w:r>
+              <w:t xml:space="preserve">Abrir no Word, no LibreOffice ou no Google Docs, imprimir e enviar.</w:t>
+            </w:r>
+          </w:p>
+        </w:tc>
+      </w:tr>
+      <w:tr>
+        <w:trPr>
+          <w:cantSplit/>
+        </w:trPr>
+        <w:tc>
+          <w:tcPr>
+            <w:tcW w:w="2687" w:type="dxa"/>
+            <w:shd w:val="clear" w:color="auto" w:fill="FFFFFF"/>
+          </w:tcPr>
+          <w:p>
+            <w:pPr>
+              <w:pStyle w:val="TextoTabela"/>
+            </w:pPr>
+            <w:r>
+              <w:t xml:space="preserve">Markdown (.md)</w:t>
+            </w:r>
+          </w:p>
+        </w:tc>
+        <w:tc>
+          <w:tcPr>
+            <w:tcW w:w="1100" w:type="dxa"/>
+            <w:shd w:val="clear" w:color="auto" w:fill="FFFFFF"/>
+          </w:tcPr>
+          <w:p>
+            <w:pPr>
+              <w:pStyle w:val="TextoTabela"/>
+            </w:pPr>
+            <w:r>
+              <w:rPr>
+                <w:rStyle w:val="Codigo"/>
+              </w:rPr>
+              <w:t xml:space="preserve">.md</w:t>
+            </w:r>
+          </w:p>
+        </w:tc>
+        <w:tc>
+          <w:tcPr>
+            <w:tcW w:w="5851" w:type="dxa"/>
+            <w:shd w:val="clear" w:color="auto" w:fill="FFFFFF"/>
+          </w:tcPr>
+          <w:p>
+            <w:pPr>
+              <w:pStyle w:val="TextoTabela"/>
+            </w:pPr>
+            <w:r>
+              <w:t xml:space="preserve">Texto simples com marcação, para outros programas de anotações.</w:t>
+            </w:r>
+          </w:p>
+        </w:tc>
+      </w:tr>
+      <w:tr>
+        <w:trPr>
+          <w:cantSplit/>
+        </w:trPr>
+        <w:tc>
+          <w:tcPr>
+            <w:tcW w:w="2687" w:type="dxa"/>
+            <w:shd w:val="clear" w:color="auto" w:fill="FFFFFF"/>
+          </w:tcPr>
+          <w:p>
+            <w:pPr>
+              <w:pStyle w:val="TextoTabela"/>
+            </w:pPr>
+            <w:r>
+              <w:t xml:space="preserve">Página HTML (.html)</w:t>
+            </w:r>
+          </w:p>
+        </w:tc>
+        <w:tc>
+          <w:tcPr>
+            <w:tcW w:w="1100" w:type="dxa"/>
+            <w:shd w:val="clear" w:color="auto" w:fill="FFFFFF"/>
+          </w:tcPr>
+          <w:p>
+            <w:pPr>
+              <w:pStyle w:val="TextoTabela"/>
+            </w:pPr>
+            <w:r>
+              <w:rPr>
+                <w:rStyle w:val="Codigo"/>
+              </w:rPr>
+              <w:t xml:space="preserve">.html</w:t>
+            </w:r>
+          </w:p>
+        </w:tc>
+        <w:tc>
+          <w:tcPr>
+            <w:tcW w:w="5851" w:type="dxa"/>
+            <w:shd w:val="clear" w:color="auto" w:fill="FFFFFF"/>
+          </w:tcPr>
+          <w:p>
+            <w:pPr>
+              <w:pStyle w:val="TextoTabela"/>
+            </w:pPr>
+            <w:r>
+              <w:t xml:space="preserve">Abrir no navegador, sem nenhum programa a mais.</w:t>
+            </w:r>
+          </w:p>
+        </w:tc>
+      </w:tr>
+    </w:tbl>
+    <w:p>
+      <w:pPr>
+        <w:pStyle w:val="Espaco"/>
+      </w:pPr>
+    </w:p>
+    <w:p>
+      <w:r>
+        <w:t xml:space="preserve">Num caderno ou numa pasta, outra lista pergunta como exportar:</w:t>
+      </w:r>
+    </w:p>
+    <w:p>
+      <w:pPr>
+        <w:pStyle w:val="ListParagraph"/>
+        <w:numPr>
+          <w:ilvl w:val="0"/>
+          <w:numId w:val="1"/>
+        </w:numPr>
+      </w:pPr>
+      <w:r>
+        <w:rPr>
+          <w:b/>
+        </w:rPr>
+        <w:t xml:space="preserve">Um arquivo com todas as folhas</w:t>
+      </w:r>
+      <w:r>
+        <w:t xml:space="preserve">: uma janela do Windows pergunta o nome e o lugar do arquivo, já com o nome do caderno ou da pasta. Se o arquivo já existe, o Windows pergunta antes de substituir.</w:t>
+      </w:r>
+    </w:p>
+    <w:p>
+      <w:pPr>
+        <w:pStyle w:val="ListParagraph"/>
+        <w:numPr>
+          <w:ilvl w:val="0"/>
+          <w:numId w:val="1"/>
+        </w:numPr>
+      </w:pPr>
+      <w:r>
+        <w:rPr>
+          <w:b/>
+        </w:rPr>
+        <w:t xml:space="preserve">Um arquivo para cada folha</w:t>
+      </w:r>
+      <w:r>
+        <w:t xml:space="preserve">: uma janela do Windows pergunta em que pasta gravar. O complemento cria ali uma pasta nova com o nome do caderno ou da pasta e grava um arquivo para cada folha, com o título da folha como nome. Numa pasta, as folhas de cada caderno ficam numa subpasta com o nome do caderno. </w:t>
+      </w:r>
+      <w:r>
+        <w:rPr>
+          <w:b/>
+        </w:rPr>
+        <w:t xml:space="preserve">Nada é sobrescrito</w:t>
+      </w:r>
+      <w:r>
+        <w:t xml:space="preserve">: se a pasta "Trabalho" já existe, a nova se chama "Trabalho (2)"; duas folhas com o mesmo título viram "Título.md" e "Título (2).md". Caracteres que o Windows não aceita em nomes de arquivo são tirados do nome.</w:t>
+      </w:r>
+    </w:p>
+    <w:p>
+      <w:r>
+        <w:t xml:space="preserve">Para uma folha só, o complemento pergunta apenas o formato e o arquivo.</w:t>
+      </w:r>
+    </w:p>
+    <w:p>
+      <w:r>
+        <w:t xml:space="preserve">A gravação acontece em segundo plano, então o NVDA continua respondendo mesmo com milhares de folhas. Ao terminar, o NVDA fala, por exemplo, "Exportado: 3 folhas, em Trabalho.docx" ou "Exportado: 12 folhas, um arquivo por folha, na pasta" e o caminho. Se não for possível gravar (pasta sem permissão, disco cheio), o NVDA fala "Não foi possível exportar para" e o caminho.</w:t>
+      </w:r>
+    </w:p>
+    <w:p>
+      <w:pPr>
+        <w:pStyle w:val="Heading2"/>
+      </w:pPr>
+      <w:bookmarkStart w:id="37" w:name="_Secao37"/>
+      <w:r>
+        <w:t xml:space="preserve">Como fica o documento</w:t>
+      </w:r>
+      <w:bookmarkEnd w:id="37"/>
+    </w:p>
+    <w:p>
+      <w:pPr>
+        <w:pStyle w:val="ListParagraph"/>
+        <w:numPr>
+          <w:ilvl w:val="0"/>
+          <w:numId w:val="1"/>
+        </w:numPr>
+      </w:pPr>
+      <w:r>
+        <w:t xml:space="preserve">Um caderno exportado num arquivo só começa com o título 1 "Caderno" e o nome, seguido da frase "Exportado do Notas Workflow NVDA em" com a data e o número de folhas. Cada folha é um </w:t>
+      </w:r>
+      <w:r>
+        <w:rPr>
+          <w:b/>
+        </w:rPr>
+        <w:t xml:space="preserve">título 2</w:t>
+      </w:r>
+      <w:r>
+        <w:t xml:space="preserve">.</w:t>
+      </w:r>
+    </w:p>
+    <w:p>
+      <w:pPr>
+        <w:pStyle w:val="ListParagraph"/>
+        <w:numPr>
+          <w:ilvl w:val="0"/>
+          <w:numId w:val="1"/>
+        </w:numPr>
+      </w:pPr>
+      <w:r>
+        <w:t xml:space="preserve">Uma pasta começa com o título 1 "Pasta" e o nome. As folhas guardadas direto nela ficam sob o título 2 "Folhas direto na pasta", e as de cada caderno sob o título 2 "Caderno" e o nome; cada folha é um </w:t>
+      </w:r>
+      <w:r>
+        <w:rPr>
+          <w:b/>
+        </w:rPr>
+        <w:t xml:space="preserve">título 3</w:t>
+      </w:r>
+      <w:r>
+        <w:t xml:space="preserve">.</w:t>
+      </w:r>
+    </w:p>
+    <w:p>
+      <w:pPr>
+        <w:pStyle w:val="ListParagraph"/>
+        <w:numPr>
+          <w:ilvl w:val="0"/>
+          <w:numId w:val="1"/>
+        </w:numPr>
+      </w:pPr>
+      <w:r>
+        <w:t xml:space="preserve">Uma folha sozinha (ou cada arquivo de "um arquivo para cada folha") tem o título da folha como </w:t>
+      </w:r>
+      <w:r>
+        <w:rPr>
+          <w:b/>
+        </w:rPr>
+        <w:t xml:space="preserve">título 1</w:t>
+      </w:r>
+      <w:r>
+        <w:t xml:space="preserve">.</w:t>
+      </w:r>
+    </w:p>
+    <w:p>
+      <w:pPr>
+        <w:pStyle w:val="ListParagraph"/>
+        <w:numPr>
+          <w:ilvl w:val="0"/>
+          <w:numId w:val="1"/>
+        </w:numPr>
+      </w:pPr>
+      <w:r>
+        <w:t xml:space="preserve">As folhas aparecem na ordem das raias: A fazer, Em andamento, Bloqueada e Concluída.</w:t>
+      </w:r>
+    </w:p>
+    <w:p>
+      <w:pPr>
+        <w:pStyle w:val="ListParagraph"/>
+        <w:numPr>
+          <w:ilvl w:val="0"/>
+          <w:numId w:val="1"/>
+        </w:numPr>
+      </w:pPr>
+      <w:r>
+        <w:t xml:space="preserve">Logo abaixo do título de cada folha vêm as linhas </w:t>
+      </w:r>
+      <w:r>
+        <w:rPr>
+          <w:b/>
+        </w:rPr>
+        <w:t xml:space="preserve">Status:</w:t>
+      </w:r>
+      <w:r>
+        <w:t xml:space="preserve">, </w:t>
+      </w:r>
+      <w:r>
+        <w:rPr>
+          <w:b/>
+        </w:rPr>
+        <w:t xml:space="preserve">Tags:</w:t>
+      </w:r>
+      <w:r>
+        <w:t xml:space="preserve"> (quando há tags) e </w:t>
+      </w:r>
+      <w:r>
+        <w:rPr>
+          <w:b/>
+        </w:rPr>
+        <w:t xml:space="preserve">Criada em … , atualizada em …</w:t>
+      </w:r>
+      <w:r>
+        <w:t xml:space="preserve">. Na exportação de uma folha só, vem também </w:t>
+      </w:r>
+      <w:r>
+        <w:rPr>
+          <w:b/>
+        </w:rPr>
+        <w:t xml:space="preserve">Local:</w:t>
+      </w:r>
+      <w:r>
+        <w:t xml:space="preserve"> com o caderno ou a pasta.</w:t>
+      </w:r>
+    </w:p>
+    <w:p>
+      <w:pPr>
+        <w:pStyle w:val="ListParagraph"/>
+        <w:numPr>
+          <w:ilvl w:val="0"/>
+          <w:numId w:val="1"/>
+        </w:numPr>
+      </w:pPr>
+      <w:r>
+        <w:t xml:space="preserve">O conteúdo mantém a formatação: negrito, itálico, tachado, código, listas com marcadores e numeradas, citações, blocos de código e divisores. Os títulos do conteúdo ficam um nível abaixo do título da folha, para a estrutura de títulos continuar em ordem.</w:t>
+      </w:r>
+    </w:p>
+    <w:p>
+      <w:r>
+        <w:t xml:space="preserve">O documento é feito para leitores de telas: no Word, os títulos usam os estilos Título 1, Título 2… e aparecem no painel de navegação; na página HTML, são títulos de verdade, navegáveis com a tecla H do NVDA. O documento tem o idioma do NVDA e o título nas propriedades do arquivo.</w:t>
+      </w:r>
+    </w:p>
+    <w:p>
+      <w:pPr>
+        <w:pStyle w:val="Heading1"/>
+      </w:pPr>
+      <w:bookmarkStart w:id="38" w:name="_Secao38"/>
+      <w:r>
         <w:t xml:space="preserve">Configurações</w:t>
       </w:r>
-      <w:bookmarkEnd w:id="34"/>
+      <w:bookmarkEnd w:id="38"/>
     </w:p>
     <w:p>
       <w:r>
@@ -5636,11 +6380,11 @@
       <w:pPr>
         <w:pStyle w:val="Heading1"/>
       </w:pPr>
-      <w:bookmarkStart w:id="35" w:name="_Secao35"/>
+      <w:bookmarkStart w:id="39" w:name="_Secao39"/>
       <w:r>
         <w:t xml:space="preserve">Onde ficam as folhas</w:t>
       </w:r>
-      <w:bookmarkEnd w:id="35"/>
+      <w:bookmarkEnd w:id="39"/>
     </w:p>
     <w:p>
       <w:r>
@@ -5678,11 +6422,11 @@
       <w:pPr>
         <w:pStyle w:val="Heading2"/>
       </w:pPr>
-      <w:bookmarkStart w:id="36" w:name="_Secao36"/>
+      <w:bookmarkStart w:id="40" w:name="_Secao40"/>
       <w:r>
         <w:t xml:space="preserve">Segurança dos dados</w:t>
       </w:r>
-      <w:bookmarkEnd w:id="36"/>
+      <w:bookmarkEnd w:id="40"/>
     </w:p>
     <w:p>
       <w:pPr>
@@ -5754,11 +6498,11 @@
       <w:pPr>
         <w:pStyle w:val="Heading2"/>
       </w:pPr>
-      <w:bookmarkStart w:id="37" w:name="_Secao37"/>
+      <w:bookmarkStart w:id="41" w:name="_Secao41"/>
       <w:r>
         <w:t xml:space="preserve">Muitas folhas</w:t>
       </w:r>
-      <w:bookmarkEnd w:id="37"/>
+      <w:bookmarkEnd w:id="41"/>
     </w:p>
     <w:p>
       <w:r>
@@ -5769,11 +6513,11 @@
       <w:pPr>
         <w:pStyle w:val="Heading2"/>
       </w:pPr>
-      <w:bookmarkStart w:id="38" w:name="_Secao38"/>
+      <w:bookmarkStart w:id="42" w:name="_Secao42"/>
       <w:r>
         <w:t xml:space="preserve">Usar em mais de um computador</w:t>
       </w:r>
-      <w:bookmarkEnd w:id="38"/>
+      <w:bookmarkEnd w:id="42"/>
     </w:p>
     <w:p>
       <w:r>
@@ -5825,21 +6569,21 @@
       <w:pPr>
         <w:pStyle w:val="Heading1"/>
       </w:pPr>
-      <w:bookmarkStart w:id="39" w:name="_Secao39"/>
+      <w:bookmarkStart w:id="43" w:name="_Secao43"/>
       <w:r>
         <w:t xml:space="preserve">Importar e exportar</w:t>
       </w:r>
-      <w:bookmarkEnd w:id="39"/>
+      <w:bookmarkEnd w:id="43"/>
     </w:p>
     <w:p>
       <w:pPr>
         <w:pStyle w:val="Heading2"/>
       </w:pPr>
-      <w:bookmarkStart w:id="40" w:name="_Secao40"/>
+      <w:bookmarkStart w:id="44" w:name="_Secao44"/>
       <w:r>
         <w:t xml:space="preserve">Exportar</w:t>
       </w:r>
-      <w:bookmarkEnd w:id="40"/>
+      <w:bookmarkEnd w:id="44"/>
     </w:p>
     <w:p>
       <w:r>
@@ -5858,18 +6602,27 @@
         <w:t xml:space="preserve">.json</w:t>
       </w:r>
       <w:r>
-        <w:t xml:space="preserve">. O NVDA fala "Exportado:" e o número de folhas. O arquivo serve como cópia de segurança e para levar as folhas para outro computador.</w:t>
+        <w:t xml:space="preserve">. O NVDA fala "Exportado:" e o número de folhas. O arquivo serve como cópia de segurança e para levar as folhas para outro computador. Para ter as folhas num documento para ler ou enviar, use o botão </w:t>
+      </w:r>
+      <w:r>
+        <w:rPr>
+          <w:b/>
+        </w:rPr>
+        <w:t xml:space="preserve">Exportar…</w:t>
+      </w:r>
+      <w:r>
+        <w:t xml:space="preserve"> da janela principal (veja Exportar como documento); esses documentos não podem ser importados de volta.</w:t>
       </w:r>
     </w:p>
     <w:p>
       <w:pPr>
         <w:pStyle w:val="Heading2"/>
       </w:pPr>
-      <w:bookmarkStart w:id="41" w:name="_Secao41"/>
+      <w:bookmarkStart w:id="45" w:name="_Secao45"/>
       <w:r>
         <w:t xml:space="preserve">Importar</w:t>
       </w:r>
-      <w:bookmarkEnd w:id="41"/>
+      <w:bookmarkEnd w:id="45"/>
     </w:p>
     <w:p>
       <w:r>
@@ -5927,21 +6680,21 @@
       <w:pPr>
         <w:pStyle w:val="Heading1"/>
       </w:pPr>
-      <w:bookmarkStart w:id="42" w:name="_Secao42"/>
+      <w:bookmarkStart w:id="46" w:name="_Secao46"/>
       <w:r>
         <w:t xml:space="preserve">Atalhos</w:t>
       </w:r>
-      <w:bookmarkEnd w:id="42"/>
+      <w:bookmarkEnd w:id="46"/>
     </w:p>
     <w:p>
       <w:pPr>
         <w:pStyle w:val="Heading2"/>
       </w:pPr>
-      <w:bookmarkStart w:id="43" w:name="_Secao43"/>
+      <w:bookmarkStart w:id="47" w:name="_Secao47"/>
       <w:r>
         <w:t xml:space="preserve">Comandos globais</w:t>
       </w:r>
-      <w:bookmarkEnd w:id="43"/>
+      <w:bookmarkEnd w:id="47"/>
     </w:p>
     <w:tbl>
       <w:tblPr>
@@ -6149,11 +6902,11 @@
       <w:pPr>
         <w:pStyle w:val="Heading2"/>
       </w:pPr>
-      <w:bookmarkStart w:id="44" w:name="_Secao44"/>
+      <w:bookmarkStart w:id="48" w:name="_Secao48"/>
       <w:r>
         <w:t xml:space="preserve">Dentro das janelas</w:t>
       </w:r>
-      <w:bookmarkEnd w:id="44"/>
+      <w:bookmarkEnd w:id="48"/>
     </w:p>
     <w:tbl>
       <w:tblPr>
@@ -6656,11 +7409,11 @@
       <w:pPr>
         <w:pStyle w:val="Heading1"/>
       </w:pPr>
-      <w:bookmarkStart w:id="45" w:name="_Secao45"/>
+      <w:bookmarkStart w:id="49" w:name="_Secao49"/>
       <w:r>
         <w:t xml:space="preserve">Mensagens faladas</w:t>
       </w:r>
-      <w:bookmarkEnd w:id="45"/>
+      <w:bookmarkEnd w:id="49"/>
     </w:p>
     <w:tbl>
       <w:tblPr>
@@ -7089,6 +7842,171 @@
               <w:pStyle w:val="TextoTabela"/>
             </w:pPr>
             <w:r>
+              <w:t xml:space="preserve">Exportado: 3 folhas, em Trabalho.docx</w:t>
+            </w:r>
+          </w:p>
+        </w:tc>
+        <w:tc>
+          <w:tcPr>
+            <w:tcW w:w="4819" w:type="dxa"/>
+            <w:shd w:val="clear" w:color="auto" w:fill="FFFFFF"/>
+          </w:tcPr>
+          <w:p>
+            <w:pPr>
+              <w:pStyle w:val="TextoTabela"/>
+            </w:pPr>
+            <w:r>
+              <w:t xml:space="preserve">Exportar… gravou o documento.</w:t>
+            </w:r>
+          </w:p>
+        </w:tc>
+      </w:tr>
+      <w:tr>
+        <w:trPr>
+          <w:cantSplit/>
+        </w:trPr>
+        <w:tc>
+          <w:tcPr>
+            <w:tcW w:w="4819" w:type="dxa"/>
+            <w:shd w:val="clear" w:color="auto" w:fill="FFFFFF"/>
+          </w:tcPr>
+          <w:p>
+            <w:pPr>
+              <w:pStyle w:val="TextoTabela"/>
+            </w:pPr>
+            <w:r>
+              <w:t xml:space="preserve">Exportado: 3 folhas, um arquivo por folha, na pasta …</w:t>
+            </w:r>
+          </w:p>
+        </w:tc>
+        <w:tc>
+          <w:tcPr>
+            <w:tcW w:w="4819" w:type="dxa"/>
+            <w:shd w:val="clear" w:color="auto" w:fill="FFFFFF"/>
+          </w:tcPr>
+          <w:p>
+            <w:pPr>
+              <w:pStyle w:val="TextoTabela"/>
+            </w:pPr>
+            <w:r>
+              <w:t xml:space="preserve">Exportar… gravou um arquivo para cada folha.</w:t>
+            </w:r>
+          </w:p>
+        </w:tc>
+      </w:tr>
+      <w:tr>
+        <w:trPr>
+          <w:cantSplit/>
+        </w:trPr>
+        <w:tc>
+          <w:tcPr>
+            <w:tcW w:w="4819" w:type="dxa"/>
+            <w:shd w:val="clear" w:color="auto" w:fill="FFFFFF"/>
+          </w:tcPr>
+          <w:p>
+            <w:pPr>
+              <w:pStyle w:val="TextoTabela"/>
+            </w:pPr>
+            <w:r>
+              <w:t xml:space="preserve">Nada para exportar: Caderno … não tem folhas.</w:t>
+            </w:r>
+          </w:p>
+        </w:tc>
+        <w:tc>
+          <w:tcPr>
+            <w:tcW w:w="4819" w:type="dxa"/>
+            <w:shd w:val="clear" w:color="auto" w:fill="FFFFFF"/>
+          </w:tcPr>
+          <w:p>
+            <w:pPr>
+              <w:pStyle w:val="TextoTabela"/>
+            </w:pPr>
+            <w:r>
+              <w:t xml:space="preserve">O caderno ou a pasta escolhida está vazia.</w:t>
+            </w:r>
+          </w:p>
+        </w:tc>
+      </w:tr>
+      <w:tr>
+        <w:trPr>
+          <w:cantSplit/>
+        </w:trPr>
+        <w:tc>
+          <w:tcPr>
+            <w:tcW w:w="4819" w:type="dxa"/>
+            <w:shd w:val="clear" w:color="auto" w:fill="FFFFFF"/>
+          </w:tcPr>
+          <w:p>
+            <w:pPr>
+              <w:pStyle w:val="TextoTabela"/>
+            </w:pPr>
+            <w:r>
+              <w:t xml:space="preserve">Não há cadernos. / Não há pastas.</w:t>
+            </w:r>
+          </w:p>
+        </w:tc>
+        <w:tc>
+          <w:tcPr>
+            <w:tcW w:w="4819" w:type="dxa"/>
+            <w:shd w:val="clear" w:color="auto" w:fill="FFFFFF"/>
+          </w:tcPr>
+          <w:p>
+            <w:pPr>
+              <w:pStyle w:val="TextoTabela"/>
+            </w:pPr>
+            <w:r>
+              <w:t xml:space="preserve">Exportar… &gt; Caderno… ou Pasta… sem nenhum caderno ou pasta.</w:t>
+            </w:r>
+          </w:p>
+        </w:tc>
+      </w:tr>
+      <w:tr>
+        <w:trPr>
+          <w:cantSplit/>
+        </w:trPr>
+        <w:tc>
+          <w:tcPr>
+            <w:tcW w:w="4819" w:type="dxa"/>
+            <w:shd w:val="clear" w:color="auto" w:fill="FFFFFF"/>
+          </w:tcPr>
+          <w:p>
+            <w:pPr>
+              <w:pStyle w:val="TextoTabela"/>
+            </w:pPr>
+            <w:r>
+              <w:t xml:space="preserve">Não foi possível exportar para …</w:t>
+            </w:r>
+          </w:p>
+        </w:tc>
+        <w:tc>
+          <w:tcPr>
+            <w:tcW w:w="4819" w:type="dxa"/>
+            <w:shd w:val="clear" w:color="auto" w:fill="FFFFFF"/>
+          </w:tcPr>
+          <w:p>
+            <w:pPr>
+              <w:pStyle w:val="TextoTabela"/>
+            </w:pPr>
+            <w:r>
+              <w:t xml:space="preserve">O documento exportado não pôde ser gravado: confira a pasta.</w:t>
+            </w:r>
+          </w:p>
+        </w:tc>
+      </w:tr>
+      <w:tr>
+        <w:trPr>
+          <w:cantSplit/>
+        </w:trPr>
+        <w:tc>
+          <w:tcPr>
+            <w:tcW w:w="4819" w:type="dxa"/>
+            <w:shd w:val="clear" w:color="auto" w:fill="FFFFFF"/>
+          </w:tcPr>
+          <w:p>
+            <w:pPr>
+              <w:pStyle w:val="TextoTabela"/>
+            </w:pPr>
+            <w:r>
               <w:t xml:space="preserve">Folhas salvas na nova pasta / Usando as folhas da nova pasta</w:t>
             </w:r>
           </w:p>
@@ -7349,11 +8267,11 @@
       <w:pPr>
         <w:pStyle w:val="Heading1"/>
       </w:pPr>
-      <w:bookmarkStart w:id="46" w:name="_Secao46"/>
+      <w:bookmarkStart w:id="50" w:name="_Secao50"/>
       <w:r>
         <w:t xml:space="preserve">Privacidade e segurança</w:t>
       </w:r>
-      <w:bookmarkEnd w:id="46"/>
+      <w:bookmarkEnd w:id="50"/>
     </w:p>
     <w:p>
       <w:pPr>
@@ -7447,23 +8365,35 @@
     </w:p>
     <w:p>
       <w:pPr>
+        <w:pStyle w:val="ListParagraph"/>
+        <w:numPr>
+          <w:ilvl w:val="0"/>
+          <w:numId w:val="1"/>
+        </w:numPr>
+      </w:pPr>
+      <w:r>
+        <w:t xml:space="preserve">Os documentos exportados levam só o que está nas folhas e na formatação do editor: scripts, estilos, links e imagens que viessem de um arquivo importado são descartados, e a página HTML não carrega nada da internet.</w:t>
+      </w:r>
+    </w:p>
+    <w:p>
+      <w:pPr>
         <w:pStyle w:val="Heading1"/>
       </w:pPr>
-      <w:bookmarkStart w:id="47" w:name="_Secao47"/>
+      <w:bookmarkStart w:id="51" w:name="_Secao51"/>
       <w:r>
         <w:t xml:space="preserve">Perguntas frequentes</w:t>
       </w:r>
-      <w:bookmarkEnd w:id="47"/>
+      <w:bookmarkEnd w:id="51"/>
     </w:p>
     <w:p>
       <w:pPr>
         <w:pStyle w:val="Heading2"/>
       </w:pPr>
-      <w:bookmarkStart w:id="48" w:name="_Secao48"/>
+      <w:bookmarkStart w:id="52" w:name="_Secao52"/>
       <w:r>
         <w:t xml:space="preserve">O NVDA diz que não foi possível salvar as folhas</w:t>
       </w:r>
-      <w:bookmarkEnd w:id="48"/>
+      <w:bookmarkEnd w:id="52"/>
     </w:p>
     <w:p>
       <w:r>
@@ -7483,11 +8413,11 @@
       <w:pPr>
         <w:pStyle w:val="Heading2"/>
       </w:pPr>
-      <w:bookmarkStart w:id="49" w:name="_Secao49"/>
+      <w:bookmarkStart w:id="53" w:name="_Secao53"/>
       <w:r>
         <w:t xml:space="preserve">Minhas folhas sumiram depois de trocar a pasta</w:t>
       </w:r>
-      <w:bookmarkEnd w:id="49"/>
+      <w:bookmarkEnd w:id="53"/>
     </w:p>
     <w:p>
       <w:r>
@@ -7498,11 +8428,11 @@
       <w:pPr>
         <w:pStyle w:val="Heading2"/>
       </w:pPr>
-      <w:bookmarkStart w:id="50" w:name="_Secao50"/>
+      <w:bookmarkStart w:id="54" w:name="_Secao54"/>
       <w:r>
         <w:t xml:space="preserve">O arquivo estava danificado</w:t>
       </w:r>
-      <w:bookmarkEnd w:id="50"/>
+      <w:bookmarkEnd w:id="54"/>
     </w:p>
     <w:p>
       <w:r>
@@ -7522,11 +8452,11 @@
       <w:pPr>
         <w:pStyle w:val="Heading2"/>
       </w:pPr>
-      <w:bookmarkStart w:id="51" w:name="_Secao51"/>
+      <w:bookmarkStart w:id="55" w:name="_Secao55"/>
       <w:r>
         <w:t xml:space="preserve">Não encontro uma folha numa raia com muitas folhas</w:t>
       </w:r>
-      <w:bookmarkEnd w:id="51"/>
+      <w:bookmarkEnd w:id="55"/>
     </w:p>
     <w:p>
       <w:r>
@@ -7537,11 +8467,11 @@
       <w:pPr>
         <w:pStyle w:val="Heading2"/>
       </w:pPr>
-      <w:bookmarkStart w:id="52" w:name="_Secao52"/>
+      <w:bookmarkStart w:id="56" w:name="_Secao56"/>
       <w:r>
         <w:t xml:space="preserve">Escrevi um asterisco e ele sumiu</w:t>
       </w:r>
-      <w:bookmarkEnd w:id="52"/>
+      <w:bookmarkEnd w:id="56"/>
     </w:p>
     <w:p>
       <w:r>
@@ -7570,11 +8500,11 @@
       <w:pPr>
         <w:pStyle w:val="Heading1"/>
       </w:pPr>
-      <w:bookmarkStart w:id="53" w:name="_Secao53"/>
+      <w:bookmarkStart w:id="57" w:name="_Secao57"/>
       <w:r>
         <w:t xml:space="preserve">Histórico deste manual</w:t>
       </w:r>
-      <w:bookmarkEnd w:id="53"/>
+      <w:bookmarkEnd w:id="57"/>
     </w:p>
     <w:tbl>
       <w:tblPr>
@@ -7754,6 +8684,39 @@
             </w:pPr>
             <w:r>
               <w:t xml:space="preserve">Botão Criar (folha, caderno e pasta); Atualizar o status da tarefa; Mover para (caderno ou pasta, e folhas guardadas direto em pastas); Enter abre a folha; sem a visualização em tabela e sem o botão Abrir; folhas listadas e abertas na janela Cadernos e pastas; campo Local; listas de 200 em 200; desempenho com 100 mil folhas; sem menções a outras plataformas.</w:t>
+            </w:r>
+          </w:p>
+        </w:tc>
+      </w:tr>
+      <w:tr>
+        <w:trPr>
+          <w:cantSplit/>
+        </w:trPr>
+        <w:tc>
+          <w:tcPr>
+            <w:tcW w:w="1302" w:type="dxa"/>
+            <w:shd w:val="clear" w:color="auto" w:fill="FFFFFF"/>
+          </w:tcPr>
+          <w:p>
+            <w:pPr>
+              <w:pStyle w:val="TextoTabela"/>
+            </w:pPr>
+            <w:r>
+              <w:t xml:space="preserve">1.4.0</w:t>
+            </w:r>
+          </w:p>
+        </w:tc>
+        <w:tc>
+          <w:tcPr>
+            <w:tcW w:w="8336" w:type="dxa"/>
+            <w:shd w:val="clear" w:color="auto" w:fill="FFFFFF"/>
+          </w:tcPr>
+          <w:p>
+            <w:pPr>
+              <w:pStyle w:val="TextoTabela"/>
+            </w:pPr>
+            <w:r>
+              <w:t xml:space="preserve">Novo botão Exportar… na janela principal e novo capítulo "Exportar como documento": folha selecionada, caderno ou pasta em Word, Markdown ou HTML, num arquivo só ou num arquivo para cada folha; novas mensagens faladas da exportação.</w:t>
             </w:r>
           </w:p>
         </w:tc>
@@ -7780,7 +8743,7 @@
       <w:pStyle w:val="Footer"/>
     </w:pPr>
     <w:r>
-      <w:t xml:space="preserve">Notas Workflow NVDA 1.3.0 — página </w:t>
+      <w:t xml:space="preserve">Notas Workflow NVDA 1.4.0 — página </w:t>
     </w:r>
     <w:r>
       <w:fldChar w:fldCharType="begin"/>

</xml_diff>